<commit_message>
Korman: rewrite Section 1 intro as a sales hook (Option B)
Replace the descriptive opener with a hook-style lead ('Most growing businesses
don't need a full-time controller and CFO...'). Client file only; templates
unchanged pending Steven's review.

Co-Authored-By: Claude Opus 4.8 <noreply@anthropic.com>
Claude-Session: https://claude.ai/code/session_01DN4EejCmNTZeYY4X9coMuA
</commit_message>
<xml_diff>
--- a/Onyx_Engagement_Letter__Korman_LLC.docx
+++ b/Onyx_Engagement_Letter__Korman_LLC.docx
@@ -818,26 +818,7 @@
         <w:jc w:val="both"/>
       </w:pPr>
       <w:r>
-        <w:t xml:space="preserve">ONYX works as an extension of the Client’s accounting team — bringing controller-level oversight and review readiness without the cost and overhead of building it in-house. On a periodic basis (generally quarterly) and as otherwise needed or requested, ONYX supports the Client’s in-house bookkeeping, keeps the books in QuickBooks accurate and review-ready, helps stand up reporting by product line, and prepares the Client for its annual financial-statement review. The services below are illustrative of what ONYX provides and are not a fixed or exhaustive list; we tailor the mix to the Client’s needs and adjust it as those needs change. </w:t>
-      </w:r>
-      <w:r>
-        <w:t xml:space="preserve">As an initial priority, ONYX will help compile the reports and supporting documentation needed to finalize the 2024 </w:t>
-      </w:r>
-      <w:proofErr w:type="gramStart"/>
-      <w:r>
-        <w:t>review, and</w:t>
-      </w:r>
-      <w:proofErr w:type="gramEnd"/>
-      <w:r>
-        <w:t xml:space="preserve"> perform catch-up and clean-up work to bring the 2025 books current and </w:t>
-      </w:r>
-      <w:proofErr w:type="gramStart"/>
-      <w:r>
-        <w:t>review-ready</w:t>
-      </w:r>
-      <w:proofErr w:type="gramEnd"/>
-      <w:r>
-        <w:t>.</w:t>
+        <w:t xml:space="preserve">Most growing businesses don’t need a full-time controller and CFO — they need that expertise without the six-figure payroll. That’s ONYX. We give the Client senior-level oversight and review-ready books without the cost or overhead of building it in-house. Partnering with the Client’s in-house bookkeeper on a periodic basis (generally quarterly) and whenever needed, we keep the QuickBooks records clean and review-ready, stand up product-line reporting, and get the Client ready for its annual financial-statement review. Think of the list below as a menu, not a fixed scope — we tailor it as needs change. First up: finalize the 2024 review, and get the 2025 books caught up, cleaned, and review-ready.</w:t>
       </w:r>
     </w:p>
     <w:p>

</xml_diff>

<commit_message>
Korman: replace scope bullet lists with a 3-column service table
Condense the Staff/Controller/CFO bullet lists into a 3-column 'packages' table
(header + 5-6 short phrases per tier), per Steven's 'less detail, a section per
service level' idea. Client file only; templates unchanged pending review.

Co-Authored-By: Claude Opus 4.8 <noreply@anthropic.com>
Claude-Session: https://claude.ai/code/session_01DN4EejCmNTZeYY4X9coMuA
</commit_message>
<xml_diff>
--- a/Onyx_Engagement_Letter__Korman_LLC.docx
+++ b/Onyx_Engagement_Letter__Korman_LLC.docx
@@ -821,373 +821,395 @@
         <w:t xml:space="preserve">Most growing businesses don’t need a full-time controller and CFO — they need that expertise without the six-figure payroll. That’s ONYX. We give the Client senior-level oversight and review-ready books without the cost or overhead of building it in-house. Partnering with the Client’s in-house bookkeeper on a periodic basis (generally quarterly) and whenever needed, we keep the QuickBooks records clean and review-ready, stand up product-line reporting, and get the Client ready for its annual financial-statement review. Think of the list below as a menu, not a fixed scope — we tailor it as needs change. First up: finalize the 2024 review, and get the 2025 books caught up, cleaned, and review-ready.</w:t>
       </w:r>
     </w:p>
-    <w:p>
-      <w:pPr>
-        <w:pStyle w:val="CLALTRHeading2"/>
-        <w:jc w:val="both"/>
-      </w:pPr>
-      <w:proofErr w:type="gramStart"/>
-      <w:r>
-        <w:t>Ongoing</w:t>
-      </w:r>
-      <w:proofErr w:type="gramEnd"/>
-      <w:r>
-        <w:t xml:space="preserve"> normal accounting services:</w:t>
-      </w:r>
-    </w:p>
-    <w:p>
-      <w:pPr>
-        <w:pStyle w:val="CLALTRNormal"/>
-        <w:numPr>
-          <w:ilvl w:val="0"/>
-          <w:numId w:val="8"/>
-        </w:numPr>
-        <w:jc w:val="both"/>
-      </w:pPr>
-      <w:r>
-        <w:t>Bookkeeping support and monthly close</w:t>
-      </w:r>
-    </w:p>
-    <w:p>
-      <w:pPr>
-        <w:pStyle w:val="CLALTRNormal"/>
-        <w:jc w:val="both"/>
-      </w:pPr>
-      <w:r>
-        <w:t>Working alongside the Client’s in-house bookkeeper, ONYX helps keep the books in QuickBooks accurate, current, and close-ready:</w:t>
-      </w:r>
-    </w:p>
-    <w:p>
-      <w:pPr>
-        <w:pStyle w:val="CLALTRNormal"/>
-        <w:numPr>
-          <w:ilvl w:val="0"/>
-          <w:numId w:val="9"/>
-        </w:numPr>
-        <w:jc w:val="both"/>
-      </w:pPr>
-      <w:r>
-        <w:t>Support the accounts payable and accounts receivable processes so transactions are recorded accurately and on time</w:t>
-      </w:r>
-    </w:p>
-    <w:p>
-      <w:pPr>
-        <w:pStyle w:val="CLALTRNormal"/>
-        <w:numPr>
-          <w:ilvl w:val="0"/>
-          <w:numId w:val="9"/>
-        </w:numPr>
-        <w:jc w:val="both"/>
-      </w:pPr>
-      <w:r>
-        <w:t>Review customer billings and cash receipts and keep sales-and-use tax tracked and current</w:t>
-      </w:r>
-    </w:p>
-    <w:p>
-      <w:pPr>
-        <w:pStyle w:val="CLALTRNormal"/>
-        <w:numPr>
-          <w:ilvl w:val="0"/>
-          <w:numId w:val="9"/>
-        </w:numPr>
-        <w:jc w:val="both"/>
-      </w:pPr>
-      <w:r>
-        <w:t>Reconcile accounts and post journal entries every month, keeping the books clean and close-ready</w:t>
-      </w:r>
-    </w:p>
-    <w:p>
-      <w:pPr>
-        <w:pStyle w:val="CLALTRNormal"/>
-        <w:numPr>
-          <w:ilvl w:val="0"/>
-          <w:numId w:val="9"/>
-        </w:numPr>
-        <w:jc w:val="both"/>
-      </w:pPr>
-      <w:r>
-        <w:t>Maintain depreciation schedules</w:t>
-      </w:r>
-    </w:p>
-    <w:p>
-      <w:pPr>
-        <w:pStyle w:val="CLALTRNormal"/>
-        <w:numPr>
-          <w:ilvl w:val="0"/>
-          <w:numId w:val="9"/>
-        </w:numPr>
-        <w:jc w:val="both"/>
-      </w:pPr>
-      <w:r>
-        <w:t>Set up and maintain class or product-line tracking in QuickBooks so the pharmaceutical and medical-equipment lines can be reported separately</w:t>
-      </w:r>
-    </w:p>
-    <w:p>
-      <w:pPr>
-        <w:pStyle w:val="CLALTRNormal"/>
-        <w:numPr>
-          <w:ilvl w:val="0"/>
-          <w:numId w:val="8"/>
-        </w:numPr>
-        <w:jc w:val="both"/>
-      </w:pPr>
-      <w:r>
-        <w:t>Controller-level oversight and reporting</w:t>
-      </w:r>
-    </w:p>
-    <w:p>
-      <w:pPr>
-        <w:pStyle w:val="CLALTRNormal"/>
-        <w:jc w:val="both"/>
-      </w:pPr>
-      <w:r>
-        <w:lastRenderedPageBreak/>
-        <w:t>A second layer of review and reporting that turns clean books into insight, so management always has accurate, timely numbers to act on:</w:t>
-      </w:r>
-    </w:p>
-    <w:p>
-      <w:pPr>
-        <w:pStyle w:val="CLALTRNormal"/>
-        <w:numPr>
-          <w:ilvl w:val="0"/>
-          <w:numId w:val="10"/>
-        </w:numPr>
-        <w:jc w:val="both"/>
-      </w:pPr>
-      <w:r>
-        <w:t>Review and approve the reconciliations and journal entries our staff prepare, adding a second layer of accuracy and control</w:t>
-      </w:r>
-    </w:p>
-    <w:p>
-      <w:pPr>
-        <w:pStyle w:val="CLALTRNormal"/>
-        <w:numPr>
-          <w:ilvl w:val="0"/>
-          <w:numId w:val="10"/>
-        </w:numPr>
-        <w:jc w:val="both"/>
-      </w:pPr>
-      <w:r>
-        <w:t>Reconcile complex accounts and prepare the related journal entries</w:t>
-      </w:r>
-    </w:p>
-    <w:p>
-      <w:pPr>
-        <w:pStyle w:val="CLALTRNormal"/>
-        <w:numPr>
-          <w:ilvl w:val="0"/>
-          <w:numId w:val="10"/>
-        </w:numPr>
-        <w:jc w:val="both"/>
-      </w:pPr>
-      <w:r>
-        <w:t>Turn the Client’s financial results into clear, actionable analysis and present it to management</w:t>
-      </w:r>
-    </w:p>
-    <w:p>
-      <w:pPr>
-        <w:pStyle w:val="CLALTRNormal"/>
-        <w:numPr>
-          <w:ilvl w:val="0"/>
-          <w:numId w:val="10"/>
-        </w:numPr>
-        <w:jc w:val="both"/>
-      </w:pPr>
-      <w:r>
-        <w:t>Develop and track the key business metrics that matter most to the Client, and review them with management on a regular basis</w:t>
-      </w:r>
-    </w:p>
-    <w:p>
-      <w:pPr>
-        <w:pStyle w:val="CLALTRNormal"/>
-        <w:numPr>
-          <w:ilvl w:val="0"/>
-          <w:numId w:val="10"/>
-        </w:numPr>
-        <w:jc w:val="both"/>
-      </w:pPr>
-      <w:r>
-        <w:t>Document the Client’s accounting processes and procedures</w:t>
-      </w:r>
-    </w:p>
-    <w:p>
-      <w:pPr>
-        <w:pStyle w:val="CLALTRNormal"/>
-        <w:numPr>
-          <w:ilvl w:val="0"/>
-          <w:numId w:val="10"/>
-        </w:numPr>
-        <w:jc w:val="both"/>
-      </w:pPr>
-      <w:r>
-        <w:t>Continuously refine and strengthen those processes as the business grows</w:t>
-      </w:r>
-    </w:p>
-    <w:p>
-      <w:pPr>
-        <w:pStyle w:val="CLALTRNormal"/>
-        <w:numPr>
-          <w:ilvl w:val="0"/>
-          <w:numId w:val="10"/>
-        </w:numPr>
-        <w:jc w:val="both"/>
-      </w:pPr>
-      <w:r>
-        <w:t>Monitor and manage cash flow so the Client always knows what’s coming in and going out</w:t>
-      </w:r>
-    </w:p>
-    <w:p>
-      <w:pPr>
-        <w:pStyle w:val="CLALTRNormal"/>
-        <w:numPr>
-          <w:ilvl w:val="0"/>
-          <w:numId w:val="10"/>
-        </w:numPr>
-        <w:jc w:val="both"/>
-      </w:pPr>
-      <w:r>
-        <w:t>Assist with TBK Bank communications, borrowing-base and collateral reporting tied to receivables and inventory, and routine information requests</w:t>
-      </w:r>
-    </w:p>
-    <w:p>
-      <w:pPr>
-        <w:pStyle w:val="CLALTRNormal"/>
-        <w:numPr>
-          <w:ilvl w:val="0"/>
-          <w:numId w:val="10"/>
-        </w:numPr>
-        <w:jc w:val="both"/>
-      </w:pPr>
-      <w:r>
-        <w:t>Gather and organize everything the Client’s tax preparer needs for the annual return</w:t>
-      </w:r>
-    </w:p>
-    <w:p>
-      <w:pPr>
-        <w:pStyle w:val="CLALTRNormal"/>
-        <w:numPr>
-          <w:ilvl w:val="0"/>
-          <w:numId w:val="10"/>
-        </w:numPr>
-        <w:jc w:val="both"/>
-      </w:pPr>
-      <w:r>
-        <w:t>Perform catch-up and clean-up accounting for the 2024 and 2025 periods to bring the books current and ready for review</w:t>
-      </w:r>
-    </w:p>
-    <w:p>
-      <w:pPr>
-        <w:pStyle w:val="CLALTRNormal"/>
-        <w:numPr>
-          <w:ilvl w:val="0"/>
-          <w:numId w:val="10"/>
-        </w:numPr>
-        <w:jc w:val="both"/>
-      </w:pPr>
-      <w:r>
-        <w:t>Keep the books and supporting schedules review- and audit-ready, and prepare the schedules and documentation requested for the annual financial-statement review</w:t>
-      </w:r>
-    </w:p>
-    <w:p>
-      <w:pPr>
-        <w:pStyle w:val="CLALTRNormal"/>
-        <w:numPr>
-          <w:ilvl w:val="0"/>
-          <w:numId w:val="10"/>
-        </w:numPr>
-        <w:jc w:val="both"/>
-      </w:pPr>
-      <w:r>
-        <w:t>Produce separate profit-and-loss reporting for the pharmaceutical and medical-equipment product lines, consolidating into a single, company-wide view</w:t>
-      </w:r>
-    </w:p>
-    <w:p>
-      <w:pPr>
-        <w:pStyle w:val="CLALTRNormal"/>
-        <w:numPr>
-          <w:ilvl w:val="0"/>
-          <w:numId w:val="8"/>
-        </w:numPr>
-        <w:jc w:val="both"/>
-      </w:pPr>
-      <w:r>
-        <w:t>CFO-level strategic support</w:t>
-      </w:r>
-    </w:p>
-    <w:p>
-      <w:pPr>
-        <w:pStyle w:val="CLALTRNormal"/>
-        <w:jc w:val="both"/>
-      </w:pPr>
-      <w:r>
-        <w:t>On an as-needed or as-requested basis, ONYX serves as the Client’s strategic financial partner, providing the guidance, perspective, and forward-looking planning of a CFO without the full-time cost:</w:t>
-      </w:r>
-    </w:p>
-    <w:p>
-      <w:pPr>
-        <w:pStyle w:val="CLALTRNormal"/>
-        <w:numPr>
-          <w:ilvl w:val="0"/>
-          <w:numId w:val="10"/>
-        </w:numPr>
-        <w:jc w:val="both"/>
-      </w:pPr>
-      <w:r>
-        <w:t>Serve as a strategic financial partner to ownership and management, offering guidance and direction across the finance function</w:t>
-      </w:r>
-    </w:p>
-    <w:p>
-      <w:pPr>
-        <w:pStyle w:val="CLALTRNormal"/>
-        <w:numPr>
-          <w:ilvl w:val="0"/>
-          <w:numId w:val="10"/>
-        </w:numPr>
-        <w:jc w:val="both"/>
-      </w:pPr>
-      <w:r>
-        <w:t>Advise on financial reporting structure, management reporting, and accounting policy</w:t>
-      </w:r>
-    </w:p>
-    <w:p>
-      <w:pPr>
-        <w:pStyle w:val="CLALTRNormal"/>
-        <w:numPr>
-          <w:ilvl w:val="0"/>
-          <w:numId w:val="10"/>
-        </w:numPr>
-        <w:jc w:val="both"/>
-      </w:pPr>
-      <w:r>
-        <w:t>Lead budgeting, forecasting, and long-term financial modeling to support growth and scenario planning</w:t>
-      </w:r>
-    </w:p>
-    <w:p>
-      <w:pPr>
-        <w:pStyle w:val="CLALTRNormal"/>
-        <w:numPr>
-          <w:ilvl w:val="0"/>
-          <w:numId w:val="10"/>
-        </w:numPr>
-        <w:jc w:val="both"/>
-      </w:pPr>
-      <w:r>
-        <w:lastRenderedPageBreak/>
-        <w:t>Support financing and lender activities — preparing packages for TBK Bank, tracking borrowing-base and loan covenants, and assisting with renewals and negotiations</w:t>
-      </w:r>
-    </w:p>
-    <w:p>
-      <w:pPr>
-        <w:pStyle w:val="CLALTRNormal"/>
-        <w:numPr>
-          <w:ilvl w:val="0"/>
-          <w:numId w:val="10"/>
-        </w:numPr>
-        <w:jc w:val="both"/>
-      </w:pPr>
-      <w:r>
-        <w:t>Provide periodic discussions with ownership and management to share insight and perspective as financial questions arise</w:t>
-      </w:r>
+    <w:tbl>
+      <w:tblPr>
+        <w:tblW w:w="5000" w:type="pct"/>
+        <w:tblBorders>
+          <w:top w:val="single" w:sz="4" w:space="0" w:color="BFBFBF"/>
+          <w:left w:val="single" w:sz="4" w:space="0" w:color="BFBFBF"/>
+          <w:bottom w:val="single" w:sz="4" w:space="0" w:color="BFBFBF"/>
+          <w:right w:val="single" w:sz="4" w:space="0" w:color="BFBFBF"/>
+          <w:insideH w:val="single" w:sz="4" w:space="0" w:color="BFBFBF"/>
+          <w:insideV w:val="single" w:sz="4" w:space="0" w:color="BFBFBF"/>
+        </w:tblBorders>
+        <w:tblLayout w:type="fixed"/>
+        <w:tblLook w:val="04A0" w:firstRow="1" w:lastRow="0" w:firstColumn="0" w:lastColumn="0" w:noHBand="0" w:noVBand="1"/>
+      </w:tblPr>
+      <w:tblGrid>
+        <w:gridCol w:w="3119"/>
+        <w:gridCol w:w="3119"/>
+        <w:gridCol w:w="3119"/>
+      </w:tblGrid>
+      <w:tr>
+        <w:tc>
+          <w:tcPr>
+            <w:tcW w:w="3119" w:type="dxa"/>
+            <w:shd w:val="clear" w:color="auto" w:fill="D6DCE4"/>
+            <w:tcMar>
+              <w:top w:w="80" w:type="dxa"/>
+              <w:left w:w="120" w:type="dxa"/>
+              <w:bottom w:w="80" w:type="dxa"/>
+              <w:right w:w="120" w:type="dxa"/>
+            </w:tcMar>
+            <w:vAlign w:val="top"/>
+          </w:tcPr>
+          <w:p>
+            <w:pPr>
+              <w:spacing w:before="40" w:after="40"/>
+              <w:jc w:val="center"/>
+            </w:pPr>
+            <w:r>
+              <w:rPr>
+                <w:b/>
+                <w:sz w:val="22"/>
+                <w:szCs w:val="22"/>
+              </w:rPr>
+              <w:t xml:space="preserve">Day-to-day accounting</w:t>
+            </w:r>
+            <w:r>
+              <w:br/>
+            </w:r>
+            <w:r>
+              <w:rPr>
+                <w:i/>
+                <w:color w:val="595959"/>
+                <w:sz w:val="16"/>
+                <w:szCs w:val="16"/>
+              </w:rPr>
+              <w:t xml:space="preserve">Bookkeeping &amp; monthly close</w:t>
+            </w:r>
+          </w:p>
+        </w:tc>
+        <w:tc>
+          <w:tcPr>
+            <w:tcW w:w="3119" w:type="dxa"/>
+            <w:shd w:val="clear" w:color="auto" w:fill="D6DCE4"/>
+            <w:tcMar>
+              <w:top w:w="80" w:type="dxa"/>
+              <w:left w:w="120" w:type="dxa"/>
+              <w:bottom w:w="80" w:type="dxa"/>
+              <w:right w:w="120" w:type="dxa"/>
+            </w:tcMar>
+            <w:vAlign w:val="top"/>
+          </w:tcPr>
+          <w:p>
+            <w:pPr>
+              <w:spacing w:before="40" w:after="40"/>
+              <w:jc w:val="center"/>
+            </w:pPr>
+            <w:r>
+              <w:rPr>
+                <w:b/>
+                <w:sz w:val="22"/>
+                <w:szCs w:val="22"/>
+              </w:rPr>
+              <w:t xml:space="preserve">Controller oversight</w:t>
+            </w:r>
+            <w:r>
+              <w:br/>
+            </w:r>
+            <w:r>
+              <w:rPr>
+                <w:i/>
+                <w:color w:val="595959"/>
+                <w:sz w:val="16"/>
+                <w:szCs w:val="16"/>
+              </w:rPr>
+              <w:t xml:space="preserve">Clean books into insight</w:t>
+            </w:r>
+          </w:p>
+        </w:tc>
+        <w:tc>
+          <w:tcPr>
+            <w:tcW w:w="3119" w:type="dxa"/>
+            <w:shd w:val="clear" w:color="auto" w:fill="D6DCE4"/>
+            <w:tcMar>
+              <w:top w:w="80" w:type="dxa"/>
+              <w:left w:w="120" w:type="dxa"/>
+              <w:bottom w:w="80" w:type="dxa"/>
+              <w:right w:w="120" w:type="dxa"/>
+            </w:tcMar>
+            <w:vAlign w:val="top"/>
+          </w:tcPr>
+          <w:p>
+            <w:pPr>
+              <w:spacing w:before="40" w:after="40"/>
+              <w:jc w:val="center"/>
+            </w:pPr>
+            <w:r>
+              <w:rPr>
+                <w:b/>
+                <w:sz w:val="22"/>
+                <w:szCs w:val="22"/>
+              </w:rPr>
+              <w:t xml:space="preserve">CFO-level strategy</w:t>
+            </w:r>
+            <w:r>
+              <w:br/>
+            </w:r>
+            <w:r>
+              <w:rPr>
+                <w:i/>
+                <w:color w:val="595959"/>
+                <w:sz w:val="16"/>
+                <w:szCs w:val="16"/>
+              </w:rPr>
+              <w:t xml:space="preserve">Forward-looking guidance</w:t>
+            </w:r>
+          </w:p>
+        </w:tc>
+      </w:tr>
+      <w:tr>
+        <w:tc>
+          <w:tcPr>
+            <w:tcW w:w="3119" w:type="dxa"/>
+            <w:tcMar>
+              <w:top w:w="80" w:type="dxa"/>
+              <w:left w:w="120" w:type="dxa"/>
+              <w:bottom w:w="80" w:type="dxa"/>
+              <w:right w:w="120" w:type="dxa"/>
+            </w:tcMar>
+            <w:vAlign w:val="top"/>
+          </w:tcPr>
+          <w:p>
+            <w:pPr>
+              <w:spacing w:after="40" w:line="240" w:lineRule="auto"/>
+              <w:ind w:left="187" w:hanging="187"/>
+            </w:pPr>
+            <w:r>
+              <w:rPr>
+                <w:sz w:val="18"/>
+                <w:szCs w:val="18"/>
+              </w:rPr>
+              <w:t xml:space="preserve">•  Accounts payable &amp; receivable support</w:t>
+            </w:r>
+          </w:p>
+          <w:p>
+            <w:pPr>
+              <w:spacing w:after="40" w:line="240" w:lineRule="auto"/>
+              <w:ind w:left="187" w:hanging="187"/>
+            </w:pPr>
+            <w:r>
+              <w:rPr>
+                <w:sz w:val="18"/>
+                <w:szCs w:val="18"/>
+              </w:rPr>
+              <w:t xml:space="preserve">•  Billings, receipts &amp; sales-tax tracking</w:t>
+            </w:r>
+          </w:p>
+          <w:p>
+            <w:pPr>
+              <w:spacing w:after="40" w:line="240" w:lineRule="auto"/>
+              <w:ind w:left="187" w:hanging="187"/>
+            </w:pPr>
+            <w:r>
+              <w:rPr>
+                <w:sz w:val="18"/>
+                <w:szCs w:val="18"/>
+              </w:rPr>
+              <w:t xml:space="preserve">•  Monthly reconciliations &amp; close</w:t>
+            </w:r>
+          </w:p>
+          <w:p>
+            <w:pPr>
+              <w:spacing w:after="40" w:line="240" w:lineRule="auto"/>
+              <w:ind w:left="187" w:hanging="187"/>
+            </w:pPr>
+            <w:r>
+              <w:rPr>
+                <w:sz w:val="18"/>
+                <w:szCs w:val="18"/>
+              </w:rPr>
+              <w:t xml:space="preserve">•  Depreciation schedules</w:t>
+            </w:r>
+          </w:p>
+          <w:p>
+            <w:pPr>
+              <w:spacing w:after="40" w:line="240" w:lineRule="auto"/>
+              <w:ind w:left="187" w:hanging="187"/>
+            </w:pPr>
+            <w:r>
+              <w:rPr>
+                <w:sz w:val="18"/>
+                <w:szCs w:val="18"/>
+              </w:rPr>
+              <w:t xml:space="preserve">•  Product-line tracking in QuickBooks</w:t>
+            </w:r>
+          </w:p>
+        </w:tc>
+        <w:tc>
+          <w:tcPr>
+            <w:tcW w:w="3119" w:type="dxa"/>
+            <w:tcMar>
+              <w:top w:w="80" w:type="dxa"/>
+              <w:left w:w="120" w:type="dxa"/>
+              <w:bottom w:w="80" w:type="dxa"/>
+              <w:right w:w="120" w:type="dxa"/>
+            </w:tcMar>
+            <w:vAlign w:val="top"/>
+          </w:tcPr>
+          <w:p>
+            <w:pPr>
+              <w:spacing w:after="40" w:line="240" w:lineRule="auto"/>
+              <w:ind w:left="187" w:hanging="187"/>
+            </w:pPr>
+            <w:r>
+              <w:rPr>
+                <w:sz w:val="18"/>
+                <w:szCs w:val="18"/>
+              </w:rPr>
+              <w:t xml:space="preserve">•  Review &amp; approve staff work; complex reconciliations</w:t>
+            </w:r>
+          </w:p>
+          <w:p>
+            <w:pPr>
+              <w:spacing w:after="40" w:line="240" w:lineRule="auto"/>
+              <w:ind w:left="187" w:hanging="187"/>
+            </w:pPr>
+            <w:r>
+              <w:rPr>
+                <w:sz w:val="18"/>
+                <w:szCs w:val="18"/>
+              </w:rPr>
+              <w:t xml:space="preserve">•  Financial analysis, reporting &amp; KPIs</w:t>
+            </w:r>
+          </w:p>
+          <w:p>
+            <w:pPr>
+              <w:spacing w:after="40" w:line="240" w:lineRule="auto"/>
+              <w:ind w:left="187" w:hanging="187"/>
+            </w:pPr>
+            <w:r>
+              <w:rPr>
+                <w:sz w:val="18"/>
+                <w:szCs w:val="18"/>
+              </w:rPr>
+              <w:t xml:space="preserve">•  Cash-flow management</w:t>
+            </w:r>
+          </w:p>
+          <w:p>
+            <w:pPr>
+              <w:spacing w:after="40" w:line="240" w:lineRule="auto"/>
+              <w:ind w:left="187" w:hanging="187"/>
+            </w:pPr>
+            <w:r>
+              <w:rPr>
+                <w:sz w:val="18"/>
+                <w:szCs w:val="18"/>
+              </w:rPr>
+              <w:t xml:space="preserve">•  TBK Bank &amp; borrowing-base reporting</w:t>
+            </w:r>
+          </w:p>
+          <w:p>
+            <w:pPr>
+              <w:spacing w:after="40" w:line="240" w:lineRule="auto"/>
+              <w:ind w:left="187" w:hanging="187"/>
+            </w:pPr>
+            <w:r>
+              <w:rPr>
+                <w:sz w:val="18"/>
+                <w:szCs w:val="18"/>
+              </w:rPr>
+              <w:t xml:space="preserve">•  2024–25 catch-up &amp; review readiness</w:t>
+            </w:r>
+          </w:p>
+          <w:p>
+            <w:pPr>
+              <w:spacing w:after="40" w:line="240" w:lineRule="auto"/>
+              <w:ind w:left="187" w:hanging="187"/>
+            </w:pPr>
+            <w:r>
+              <w:rPr>
+                <w:sz w:val="18"/>
+                <w:szCs w:val="18"/>
+              </w:rPr>
+              <w:t xml:space="preserve">•  Product-line P&amp;L &amp; tax-prep support</w:t>
+            </w:r>
+          </w:p>
+        </w:tc>
+        <w:tc>
+          <w:tcPr>
+            <w:tcW w:w="3119" w:type="dxa"/>
+            <w:tcMar>
+              <w:top w:w="80" w:type="dxa"/>
+              <w:left w:w="120" w:type="dxa"/>
+              <w:bottom w:w="80" w:type="dxa"/>
+              <w:right w:w="120" w:type="dxa"/>
+            </w:tcMar>
+            <w:vAlign w:val="top"/>
+          </w:tcPr>
+          <w:p>
+            <w:pPr>
+              <w:spacing w:after="40" w:line="240" w:lineRule="auto"/>
+              <w:ind w:left="187" w:hanging="187"/>
+            </w:pPr>
+            <w:r>
+              <w:rPr>
+                <w:sz w:val="18"/>
+                <w:szCs w:val="18"/>
+              </w:rPr>
+              <w:t xml:space="preserve">•  Strategic financial partner to ownership</w:t>
+            </w:r>
+          </w:p>
+          <w:p>
+            <w:pPr>
+              <w:spacing w:after="40" w:line="240" w:lineRule="auto"/>
+              <w:ind w:left="187" w:hanging="187"/>
+            </w:pPr>
+            <w:r>
+              <w:rPr>
+                <w:sz w:val="18"/>
+                <w:szCs w:val="18"/>
+              </w:rPr>
+              <w:t xml:space="preserve">•  Budgeting, forecasting &amp; modeling</w:t>
+            </w:r>
+          </w:p>
+          <w:p>
+            <w:pPr>
+              <w:spacing w:after="40" w:line="240" w:lineRule="auto"/>
+              <w:ind w:left="187" w:hanging="187"/>
+            </w:pPr>
+            <w:r>
+              <w:rPr>
+                <w:sz w:val="18"/>
+                <w:szCs w:val="18"/>
+              </w:rPr>
+              <w:t xml:space="preserve">•  Financing &amp; lender support (TBK)</w:t>
+            </w:r>
+          </w:p>
+          <w:p>
+            <w:pPr>
+              <w:spacing w:after="40" w:line="240" w:lineRule="auto"/>
+              <w:ind w:left="187" w:hanging="187"/>
+            </w:pPr>
+            <w:r>
+              <w:rPr>
+                <w:sz w:val="18"/>
+                <w:szCs w:val="18"/>
+              </w:rPr>
+              <w:t xml:space="preserve">•  Reporting-structure &amp; policy advice</w:t>
+            </w:r>
+          </w:p>
+          <w:p>
+            <w:pPr>
+              <w:spacing w:after="40" w:line="240" w:lineRule="auto"/>
+              <w:ind w:left="187" w:hanging="187"/>
+            </w:pPr>
+            <w:r>
+              <w:rPr>
+                <w:sz w:val="18"/>
+                <w:szCs w:val="18"/>
+              </w:rPr>
+              <w:t xml:space="preserve">•  Ongoing insight as questions arise</w:t>
+            </w:r>
+          </w:p>
+        </w:tc>
+      </w:tr>
+    </w:tbl>
+    <w:p>
+      <w:pPr>
+        <w:spacing w:before="40"/>
+      </w:pPr>
     </w:p>
     <w:p>
       <w:pPr>

</xml_diff>